<commit_message>
STOR-39 fejl dokumentáció képek
</commit_message>
<xml_diff>
--- a/Dokumentációk/Stormy-Fejlesztői dokumentáció.docx
+++ b/Dokumentációk/Stormy-Fejlesztői dokumentáció.docx
@@ -3194,6 +3194,156 @@
           <w:lang w:eastAsia="hu-HU"/>
         </w:rPr>
       </w:pPr>
+      <w:r>
+        <w:rPr>
+          <w:rFonts w:ascii="Times New Roman" w:eastAsia="Times New Roman" w:hAnsi="Times New Roman" w:cs="Times New Roman"/>
+          <w:noProof/>
+          <w:color w:val="000000" w:themeColor="text1"/>
+          <w:sz w:val="24"/>
+          <w:szCs w:val="24"/>
+          <w:lang w:eastAsia="hu-HU"/>
+        </w:rPr>
+        <w:lastRenderedPageBreak/>
+        <w:drawing>
+          <wp:anchor distT="0" distB="0" distL="114300" distR="114300" simplePos="0" relativeHeight="251658240" behindDoc="0" locked="0" layoutInCell="1" allowOverlap="1">
+            <wp:simplePos x="0" y="0"/>
+            <wp:positionH relativeFrom="column">
+              <wp:posOffset>0</wp:posOffset>
+            </wp:positionH>
+            <wp:positionV relativeFrom="paragraph">
+              <wp:posOffset>0</wp:posOffset>
+            </wp:positionV>
+            <wp:extent cx="6962775" cy="1505308"/>
+            <wp:effectExtent l="0" t="0" r="0" b="0"/>
+            <wp:wrapSquare wrapText="bothSides"/>
+            <wp:docPr id="5" name="Kép 5"/>
+            <wp:cNvGraphicFramePr>
+              <a:graphicFrameLocks xmlns:a="http://schemas.openxmlformats.org/drawingml/2006/main" noChangeAspect="1"/>
+            </wp:cNvGraphicFramePr>
+            <a:graphic xmlns:a="http://schemas.openxmlformats.org/drawingml/2006/main">
+              <a:graphicData uri="http://schemas.openxmlformats.org/drawingml/2006/picture">
+                <pic:pic xmlns:pic="http://schemas.openxmlformats.org/drawingml/2006/picture">
+                  <pic:nvPicPr>
+                    <pic:cNvPr id="5" name="4.resz.fejl dokumentacio.png"/>
+                    <pic:cNvPicPr/>
+                  </pic:nvPicPr>
+                  <pic:blipFill>
+                    <a:blip r:embed="rId8">
+                      <a:extLst>
+                        <a:ext uri="{28A0092B-C50C-407E-A947-70E740481C1C}">
+                          <a14:useLocalDpi xmlns:a14="http://schemas.microsoft.com/office/drawing/2010/main" val="0"/>
+                        </a:ext>
+                      </a:extLst>
+                    </a:blip>
+                    <a:stretch>
+                      <a:fillRect/>
+                    </a:stretch>
+                  </pic:blipFill>
+                  <pic:spPr>
+                    <a:xfrm>
+                      <a:off x="0" y="0"/>
+                      <a:ext cx="7032137" cy="1520304"/>
+                    </a:xfrm>
+                    <a:prstGeom prst="rect">
+                      <a:avLst/>
+                    </a:prstGeom>
+                  </pic:spPr>
+                </pic:pic>
+              </a:graphicData>
+            </a:graphic>
+          </wp:anchor>
+        </w:drawing>
+      </w:r>
+      <w:r>
+        <w:rPr>
+          <w:rFonts w:ascii="Times New Roman" w:eastAsia="Times New Roman" w:hAnsi="Times New Roman" w:cs="Times New Roman"/>
+          <w:noProof/>
+          <w:color w:val="000000" w:themeColor="text1"/>
+          <w:sz w:val="24"/>
+          <w:szCs w:val="24"/>
+          <w:lang w:eastAsia="hu-HU"/>
+        </w:rPr>
+        <w:drawing>
+          <wp:inline distT="0" distB="0" distL="0" distR="0">
+            <wp:extent cx="3851638" cy="4733925"/>
+            <wp:effectExtent l="0" t="0" r="0" b="0"/>
+            <wp:docPr id="6" name="Kép 6"/>
+            <wp:cNvGraphicFramePr>
+              <a:graphicFrameLocks xmlns:a="http://schemas.openxmlformats.org/drawingml/2006/main" noChangeAspect="1"/>
+            </wp:cNvGraphicFramePr>
+            <a:graphic xmlns:a="http://schemas.openxmlformats.org/drawingml/2006/main">
+              <a:graphicData uri="http://schemas.openxmlformats.org/drawingml/2006/picture">
+                <pic:pic xmlns:pic="http://schemas.openxmlformats.org/drawingml/2006/picture">
+                  <pic:nvPicPr>
+                    <pic:cNvPr id="6" name="4.resz fejl.dokumentacio.png"/>
+                    <pic:cNvPicPr/>
+                  </pic:nvPicPr>
+                  <pic:blipFill>
+                    <a:blip r:embed="rId9">
+                      <a:extLst>
+                        <a:ext uri="{28A0092B-C50C-407E-A947-70E740481C1C}">
+                          <a14:useLocalDpi xmlns:a14="http://schemas.microsoft.com/office/drawing/2010/main" val="0"/>
+                        </a:ext>
+                      </a:extLst>
+                    </a:blip>
+                    <a:stretch>
+                      <a:fillRect/>
+                    </a:stretch>
+                  </pic:blipFill>
+                  <pic:spPr>
+                    <a:xfrm>
+                      <a:off x="0" y="0"/>
+                      <a:ext cx="3861745" cy="4746347"/>
+                    </a:xfrm>
+                    <a:prstGeom prst="rect">
+                      <a:avLst/>
+                    </a:prstGeom>
+                  </pic:spPr>
+                </pic:pic>
+              </a:graphicData>
+            </a:graphic>
+          </wp:inline>
+        </w:drawing>
+      </w:r>
+    </w:p>
+    <w:p>
+      <w:pPr>
+        <w:spacing w:before="100" w:beforeAutospacing="1" w:after="100" w:afterAutospacing="1" w:line="360" w:lineRule="auto"/>
+        <w:jc w:val="both"/>
+        <w:rPr>
+          <w:rFonts w:ascii="Times New Roman" w:eastAsia="Times New Roman" w:hAnsi="Times New Roman" w:cs="Times New Roman"/>
+          <w:color w:val="000000" w:themeColor="text1"/>
+          <w:sz w:val="24"/>
+          <w:szCs w:val="24"/>
+          <w:lang w:eastAsia="hu-HU"/>
+        </w:rPr>
+      </w:pPr>
+    </w:p>
+    <w:p>
+      <w:pPr>
+        <w:spacing w:before="100" w:beforeAutospacing="1" w:after="100" w:afterAutospacing="1" w:line="360" w:lineRule="auto"/>
+        <w:jc w:val="both"/>
+        <w:rPr>
+          <w:rFonts w:ascii="Times New Roman" w:eastAsia="Times New Roman" w:hAnsi="Times New Roman" w:cs="Times New Roman"/>
+          <w:color w:val="000000" w:themeColor="text1"/>
+          <w:sz w:val="24"/>
+          <w:szCs w:val="24"/>
+          <w:lang w:eastAsia="hu-HU"/>
+        </w:rPr>
+      </w:pPr>
+    </w:p>
+    <w:p>
+      <w:pPr>
+        <w:spacing w:before="100" w:beforeAutospacing="1" w:after="100" w:afterAutospacing="1" w:line="360" w:lineRule="auto"/>
+        <w:jc w:val="both"/>
+        <w:rPr>
+          <w:rFonts w:ascii="Times New Roman" w:eastAsia="Times New Roman" w:hAnsi="Times New Roman" w:cs="Times New Roman"/>
+          <w:color w:val="000000" w:themeColor="text1"/>
+          <w:sz w:val="24"/>
+          <w:szCs w:val="24"/>
+          <w:lang w:eastAsia="hu-HU"/>
+        </w:rPr>
+      </w:pPr>
     </w:p>
     <w:p>
       <w:pPr>
@@ -3259,6 +3409,7 @@
           <w:szCs w:val="24"/>
           <w:lang w:eastAsia="hu-HU"/>
         </w:rPr>
+        <w:lastRenderedPageBreak/>
         <w:t>5. Tesztelési dokumentáció</w:t>
       </w:r>
     </w:p>
@@ -4418,8 +4569,6 @@
           <w:lang w:eastAsia="hu-HU"/>
         </w:rPr>
       </w:pPr>
-      <w:bookmarkStart w:id="0" w:name="_GoBack"/>
-      <w:bookmarkEnd w:id="0"/>
     </w:p>
     <w:p>
       <w:pPr>
@@ -4472,6 +4621,7 @@
           <w:szCs w:val="24"/>
           <w:lang w:eastAsia="hu-HU"/>
         </w:rPr>
+        <w:lastRenderedPageBreak/>
         <w:t>6. Fejlesztési lehetőségek</w:t>
       </w:r>
     </w:p>
@@ -4626,6 +4776,8 @@
           <w:szCs w:val="24"/>
         </w:rPr>
       </w:pPr>
+      <w:bookmarkStart w:id="0" w:name="_GoBack"/>
+      <w:bookmarkEnd w:id="0"/>
     </w:p>
     <w:sectPr>
       <w:pgSz w:w="11906" w:h="16838"/>

</xml_diff>

<commit_message>
STOr-39 fejl dokumentácio kész
</commit_message>
<xml_diff>
--- a/Dokumentációk/Stormy-Fejlesztői dokumentáció.docx
+++ b/Dokumentációk/Stormy-Fejlesztői dokumentáció.docx
@@ -1463,8 +1463,8 @@
         </w:rPr>
         <w:drawing>
           <wp:inline distT="0" distB="0" distL="0" distR="0" wp14:anchorId="74181EBA" wp14:editId="5C5FAE52">
-            <wp:extent cx="4333875" cy="2638447"/>
-            <wp:effectExtent l="0" t="0" r="0" b="9525"/>
+            <wp:extent cx="3895725" cy="2597151"/>
+            <wp:effectExtent l="0" t="0" r="0" b="0"/>
             <wp:docPr id="3" name="Kép 3"/>
             <wp:cNvGraphicFramePr>
               <a:graphicFrameLocks xmlns:a="http://schemas.openxmlformats.org/drawingml/2006/main" noChangeAspect="1"/>
@@ -1491,7 +1491,7 @@
                   <pic:spPr>
                     <a:xfrm>
                       <a:off x="0" y="0"/>
-                      <a:ext cx="4363363" cy="2656399"/>
+                      <a:ext cx="3896978" cy="2597986"/>
                     </a:xfrm>
                     <a:prstGeom prst="rect">
                       <a:avLst/>
@@ -2413,6 +2413,8 @@
         <w:lastRenderedPageBreak/>
         <w:t>4. Tipikus algoritmusok bemutatása</w:t>
       </w:r>
+      <w:bookmarkStart w:id="0" w:name="_GoBack"/>
+      <w:bookmarkEnd w:id="0"/>
     </w:p>
     <w:p>
       <w:pPr>
@@ -4776,8 +4778,6 @@
           <w:szCs w:val="24"/>
         </w:rPr>
       </w:pPr>
-      <w:bookmarkStart w:id="0" w:name="_GoBack"/>
-      <w:bookmarkEnd w:id="0"/>
     </w:p>
     <w:sectPr>
       <w:pgSz w:w="11906" w:h="16838"/>

</xml_diff>